<commit_message>
VP1: empate não conta como virada (309 no Brasil) e nomes completos do grupo
Co-Authored-By: Claude Opus 5.5 <noreply@anthropic.com>
Claude-Session: https://claude.ai/code/session_01P7xh9TCwgittTk7wtXvEk9
</commit_message>
<xml_diff>
--- a/vp1/GL304_VP1_roteiro.docx
+++ b/vp1/GL304_VP1_roteiro.docx
@@ -133,7 +133,7 @@
         <w:t xml:space="preserve"> </w:t>
       </w:r>
       <w:r>
-        <w:t xml:space="preserve">André Traquia, Vinícius [SOBRENOME], Victor Olivetti ·</w:t>
+        <w:t xml:space="preserve">André Traquia, Vinícius de Souza Côrte Brilho, Victor Olivetti Regina ·</w:t>
       </w:r>
       <w:r>
         <w:t xml:space="preserve"> </w:t>
@@ -290,7 +290,7 @@
           <w:bCs/>
           <w:b/>
         </w:rPr>
-        <w:t xml:space="preserve">310 municípios trocaram de vencedor</w:t>
+        <w:t xml:space="preserve">309 municípios trocaram de vencedor</w:t>
       </w:r>
       <w:r>
         <w:t xml:space="preserve">, onde votam</w:t>
@@ -306,7 +306,7 @@
         <w:t xml:space="preserve">9,36 milhões de eleitores aptos</w:t>
       </w:r>
       <w:r>
-        <w:t xml:space="preserve">. Em 279 deles o vencedor passou a ser o candidato 22 e em 31 o 13. Mesmo assim, o 13 ganhou com margem maior no total nacional. Isso mostra que contar municípios não basta: é preciso ponderar tamanho e margem. Em</w:t>
+        <w:t xml:space="preserve">. Em 278 deles o vencedor passou a ser o candidato 22 e em 31 o 13. Mesmo assim, o 13 ganhou com margem maior no total nacional. Isso mostra que contar municípios não basta: é preciso ponderar tamanho e margem. Em</w:t>
       </w:r>
       <w:r>
         <w:t xml:space="preserve"> </w:t>
@@ -340,7 +340,7 @@
         <w:t xml:space="preserve"> </w:t>
       </w:r>
       <w:r>
-        <w:t xml:space="preserve">33 dos 645 municípios viraram (29 para o 22, 4 para o 13), com 625.523 eleitores aptos. Os maiores: São Vicente (256 mil aptos, margem 2026 de 0,75 p.p.), Poá, Ribeirão Pires (0,15 p.p.) e Mongaguá.</w:t>
+        <w:t xml:space="preserve">33 dos 645 municípios viraram (29 para o 22, 4 para o 13), com 625.523 eleitores aptos. As 4 que foram para o 13 são médias ou grandes, e as 29 que foram para o 22 são quase todas pequenas. Os maiores: São Vicente (256 mil aptos, margem 2026 de 0,75 p.p.), Poá, Ribeirão Pires (0,15 p.p.) e Mongaguá.</w:t>
       </w:r>
     </w:p>
     <w:p>
@@ -358,7 +358,7 @@
         <w:t xml:space="preserve"> </w:t>
       </w:r>
       <w:r>
-        <w:t xml:space="preserve">os 5.569 municípios com dado nos dois anos. Boa Esperança do Norte (MT) foi instalado depois de 2022 e fica fora da comparação.</w:t>
+        <w:t xml:space="preserve">os 5.570 municípios com dado nos dois anos. Boa Esperança do Norte (MT) foi instalado depois de 2022 e fica fora. Empate não conta como virada (ex.: Marquinho-PR empatou em 2026).</w:t>
       </w:r>
     </w:p>
     <w:p>
@@ -778,7 +778,7 @@
         <w:t xml:space="preserve"> </w:t>
       </w:r>
       <w:r>
-        <w:t xml:space="preserve">C1 a C5 mais os quatro fatores do ISDEL (Educação, Densidade Empresarial, Tecido Empresarial, Gestão Pública). A leitura é de capacidade local: mais base empresarial e gestão estruturada significam mais associações comerciais, imprensa local e lideranças para levar a mensagem, ou seja, menor custo por eleitor alcançado. Os pesos ficam [a definir no grupo]. Proposta: 60% eleitoral e 40% ISDEL.</w:t>
+        <w:t xml:space="preserve">C1 a C5 mais os quatro fatores do ISDEL (Educação, Densidade Empresarial, Tecido Empresarial, Gestão Pública). A leitura é de capacidade local: mais base empresarial e gestão estruturada significam mais associações comerciais, imprensa local e lideranças para levar a mensagem, ou seja, menor custo por eleitor alcançado. Os pesos ficam [a definir no grupo]. Proposta: 60% eleitoral e 40% ISDEL. Nos fatores do ISDEL, quanto maior, melhor.</w:t>
       </w:r>
     </w:p>
     <w:p>
@@ -2116,7 +2116,7 @@
               <w:t xml:space="preserve">“</w:t>
             </w:r>
             <w:r>
-              <w:t xml:space="preserve">Em 2026, 310 municípios mudaram de lado. 9 milhões de eleitores. Se você coordena uma campanha, onde você vai em 2030?</w:t>
+              <w:t xml:space="preserve">Em 2026, 309 municípios mudaram de lado. 9 milhões de eleitores. Se você coordena uma campanha, onde você vai em 2030?</w:t>
             </w:r>
             <w:r>
               <w:t xml:space="preserve">”</w:t>
@@ -2193,7 +2193,7 @@
               <w:jc w:val="left"/>
             </w:pPr>
             <w:r>
-              <w:t xml:space="preserve">Contador 5.570 → 310 → top 10, ícones de verba e agenda</w:t>
+              <w:t xml:space="preserve">Contador 5.570 → 309 → top 10, ícones de verba e agenda</w:t>
             </w:r>
           </w:p>
         </w:tc>
@@ -2672,7 +2672,7 @@
         <w:t xml:space="preserve">“</w:t>
       </w:r>
       <w:r>
-        <w:t xml:space="preserve">310 municípios viraram</w:t>
+        <w:t xml:space="preserve">309 municípios viraram</w:t>
       </w:r>
       <w:r>
         <w:t xml:space="preserve">”</w:t>
@@ -2815,7 +2815,7 @@
               <w:jc w:val="left"/>
             </w:pPr>
             <w:r>
-              <w:t xml:space="preserve">Vinícius [SOBRENOME]</w:t>
+              <w:t xml:space="preserve">Vinícius de Souza Côrte Brilho</w:t>
             </w:r>
           </w:p>
         </w:tc>
@@ -2853,7 +2853,7 @@
               <w:jc w:val="left"/>
             </w:pPr>
             <w:r>
-              <w:t xml:space="preserve">Victor Olivetti</w:t>
+              <w:t xml:space="preserve">Victor Olivetti Regina</w:t>
             </w:r>
           </w:p>
         </w:tc>

</xml_diff>